<commit_message>
Add master-admin controls and pre-filled auction defaults
The auction editor now pre-fills the desk standards as numbers
(minimum bid 1,000,000; multiples 100,000) and drops the clean-price
band fields - the sanity band (50-200 per 100) applies automatically
server-side. The staff auction card no longer shows the band chip.

The MASTER_ADMIN account gains a Login Activity tab fed by a new
AdminLog sheet (sign-ins, failed attempts, lockouts, password
creations; last 200 shown) and a master-only Delete per auction row,
identity-checked and logged; deleted auctions keep their recorded bids
in the register and stay downloadable as archived entries in reports.

Co-Authored-By: Claude Fable 5 <noreply@anthropic.com>
Claude-Session: https://claude.ai/code/session_01HuQZzogMBEn7GvJK74AkKz
</commit_message>
<xml_diff>
--- a/docs/Bid-Portal-Manual.docx
+++ b/docs/Bid-Portal-Manual.docx
@@ -3204,7 +3204,7 @@
         <w:t xml:space="preserve">New auction</w:t>
       </w:r>
       <w:r>
-        <w:t xml:space="preserve">. Fill number, security, dates, minimum, multiples, price band → </w:t>
+        <w:t xml:space="preserve">. Fill number, security and dates — the minimum bid (1,000,000) and multiples (100,000) are pre-filled as numbers — then </w:t>
       </w:r>
       <w:r>
         <w:rPr>
@@ -3215,6 +3215,26 @@
       </w:r>
       <w:r>
         <w:t xml:space="preserve">. Staff portals show it within ≈ 2 minutes.</w:t>
+      </w:r>
+    </w:p>
+    <w:p>
+      <w:pPr>
+        <w:pStyle w:val="ListParagraph"/>
+        <w:numPr>
+          <w:ilvl w:val="0"/>
+          <w:numId w:val="2"/>
+        </w:numPr>
+        <w:spacing w:after="80"/>
+      </w:pPr>
+      <w:r>
+        <w:rPr>
+          <w:b/>
+          <w:bCs/>
+        </w:rPr>
+        <w:t xml:space="preserve">Master admin extras: </w:t>
+      </w:r>
+      <w:r>
+        <w:t xml:space="preserve">the first e-mail in the admin list is the MASTER admin — only that account sees the Login Activity tab (who signed in, failed attempts, lockouts, password creations) and can DELETE an auction. Deleting removes the auction only; its recorded bids stay in the register as archived.</w:t>
       </w:r>
     </w:p>
     <w:p>

</xml_diff>

<commit_message>
Add master-admin controls and pre-filled auction defaults (#18)
The auction editor now pre-fills the desk standards as numbers
(minimum bid 1,000,000; multiples 100,000) and drops the clean-price
band fields - the sanity band (50-200 per 100) applies automatically
server-side. The staff auction card no longer shows the band chip.

The MASTER_ADMIN account gains a Login Activity tab fed by a new
AdminLog sheet (sign-ins, failed attempts, lockouts, password
creations; last 200 shown) and a master-only Delete per auction row,
identity-checked and logged; deleted auctions keep their recorded bids
in the register and stay downloadable as archived entries in reports.


Claude-Session: https://claude.ai/code/session_01HuQZzogMBEn7GvJK74AkKz

Co-authored-by: Claude <noreply@anthropic.com>
</commit_message>
<xml_diff>
--- a/docs/Bid-Portal-Manual.docx
+++ b/docs/Bid-Portal-Manual.docx
@@ -3204,7 +3204,7 @@
         <w:t xml:space="preserve">New auction</w:t>
       </w:r>
       <w:r>
-        <w:t xml:space="preserve">. Fill number, security, dates, minimum, multiples, price band → </w:t>
+        <w:t xml:space="preserve">. Fill number, security and dates — the minimum bid (1,000,000) and multiples (100,000) are pre-filled as numbers — then </w:t>
       </w:r>
       <w:r>
         <w:rPr>
@@ -3215,6 +3215,26 @@
       </w:r>
       <w:r>
         <w:t xml:space="preserve">. Staff portals show it within ≈ 2 minutes.</w:t>
+      </w:r>
+    </w:p>
+    <w:p>
+      <w:pPr>
+        <w:pStyle w:val="ListParagraph"/>
+        <w:numPr>
+          <w:ilvl w:val="0"/>
+          <w:numId w:val="2"/>
+        </w:numPr>
+        <w:spacing w:after="80"/>
+      </w:pPr>
+      <w:r>
+        <w:rPr>
+          <w:b/>
+          <w:bCs/>
+        </w:rPr>
+        <w:t xml:space="preserve">Master admin extras: </w:t>
+      </w:r>
+      <w:r>
+        <w:t xml:space="preserve">the first e-mail in the admin list is the MASTER admin — only that account sees the Login Activity tab (who signed in, failed attempts, lockouts, password creations) and can DELETE an auction. Deleting removes the auction only; its recorded bids stay in the register as archived.</w:t>
       </w:r>
     </w:p>
     <w:p>

</xml_diff>